<commit_message>
Refactor index.js to move FinalCTA component placement and update Profile.docx
</commit_message>
<xml_diff>
--- a/samples/Profile.docx
+++ b/samples/Profile.docx
@@ -643,8 +643,149 @@
           <w:kern w:val="0"/>
           <w14:ligatures w14:val="none"/>
         </w:rPr>
-        <w:t>dashboards</w:t>
-      </w:r>
+        <w:t>D</w:t>
+      </w:r>
+      <w:r>
+        <w:rPr>
+          <w:rFonts w:ascii="Calibri Light" w:eastAsia="Times New Roman" w:hAnsi="Calibri Light" w:cs="Calibri Light"/>
+          <w:kern w:val="0"/>
+          <w14:ligatures w14:val="none"/>
+        </w:rPr>
+        <w:t>ashboards</w:t>
+      </w:r>
+    </w:p>
+    <w:p>
+      <w:pPr>
+        <w:spacing w:before="100" w:beforeAutospacing="1" w:after="100" w:afterAutospacing="1" w:line="240" w:lineRule="auto"/>
+        <w:rPr>
+          <w:rFonts w:ascii="Calibri Light" w:eastAsia="Times New Roman" w:hAnsi="Calibri Light" w:cs="Calibri Light"/>
+          <w:kern w:val="0"/>
+          <w14:ligatures w14:val="none"/>
+        </w:rPr>
+      </w:pPr>
+    </w:p>
+    <w:p>
+      <w:pPr>
+        <w:spacing w:before="100" w:beforeAutospacing="1" w:after="100" w:afterAutospacing="1" w:line="240" w:lineRule="auto"/>
+        <w:rPr>
+          <w:rFonts w:ascii="Calibri Light" w:eastAsia="Times New Roman" w:hAnsi="Calibri Light" w:cs="Calibri Light"/>
+          <w:b/>
+          <w:bCs/>
+          <w:kern w:val="0"/>
+          <w:sz w:val="36"/>
+          <w:szCs w:val="36"/>
+          <w14:ligatures w14:val="none"/>
+        </w:rPr>
+      </w:pPr>
+      <w:r>
+        <w:rPr>
+          <w:rFonts w:ascii="Calibri Light" w:eastAsia="Times New Roman" w:hAnsi="Calibri Light" w:cs="Calibri Light"/>
+          <w:b/>
+          <w:bCs/>
+          <w:kern w:val="0"/>
+          <w:sz w:val="36"/>
+          <w:szCs w:val="36"/>
+          <w14:ligatures w14:val="none"/>
+        </w:rPr>
+        <w:lastRenderedPageBreak/>
+        <w:t>My Stack</w:t>
+      </w:r>
+    </w:p>
+    <w:p>
+      <w:pPr>
+        <w:spacing w:before="100" w:beforeAutospacing="1" w:after="100" w:afterAutospacing="1" w:line="240" w:lineRule="auto"/>
+        <w:rPr>
+          <w:rFonts w:ascii="Calibri Light" w:eastAsia="Times New Roman" w:hAnsi="Calibri Light" w:cs="Calibri Light"/>
+          <w:kern w:val="0"/>
+          <w14:ligatures w14:val="none"/>
+        </w:rPr>
+      </w:pPr>
+      <w:r>
+        <w:rPr>
+          <w:rFonts w:ascii="Calibri Light" w:eastAsia="Times New Roman" w:hAnsi="Calibri Light" w:cs="Calibri Light"/>
+          <w:kern w:val="0"/>
+          <w14:ligatures w14:val="none"/>
+        </w:rPr>
+        <w:t xml:space="preserve">Cursor, </w:t>
+      </w:r>
+      <w:r>
+        <w:rPr>
+          <w:rFonts w:ascii="Calibri Light" w:eastAsia="Times New Roman" w:hAnsi="Calibri Light" w:cs="Calibri Light"/>
+          <w:kern w:val="0"/>
+          <w14:ligatures w14:val="none"/>
+        </w:rPr>
+        <w:t xml:space="preserve">GitHub, </w:t>
+      </w:r>
+      <w:r>
+        <w:rPr>
+          <w:rFonts w:ascii="Calibri Light" w:eastAsia="Times New Roman" w:hAnsi="Calibri Light" w:cs="Calibri Light"/>
+          <w:kern w:val="0"/>
+          <w14:ligatures w14:val="none"/>
+        </w:rPr>
+        <w:t>GoDaddy</w:t>
+      </w:r>
+      <w:r>
+        <w:rPr>
+          <w:rFonts w:ascii="Calibri Light" w:eastAsia="Times New Roman" w:hAnsi="Calibri Light" w:cs="Calibri Light"/>
+          <w:kern w:val="0"/>
+          <w14:ligatures w14:val="none"/>
+        </w:rPr>
+        <w:t xml:space="preserve"> domains, Microsoft Email,</w:t>
+      </w:r>
+      <w:r>
+        <w:rPr>
+          <w:rFonts w:ascii="Calibri Light" w:eastAsia="Times New Roman" w:hAnsi="Calibri Light" w:cs="Calibri Light"/>
+          <w:kern w:val="0"/>
+          <w14:ligatures w14:val="none"/>
+        </w:rPr>
+        <w:t xml:space="preserve"> </w:t>
+      </w:r>
+      <w:r>
+        <w:rPr>
+          <w:rFonts w:ascii="Calibri Light" w:eastAsia="Times New Roman" w:hAnsi="Calibri Light" w:cs="Calibri Light"/>
+          <w:kern w:val="0"/>
+          <w14:ligatures w14:val="none"/>
+        </w:rPr>
+        <w:t>Microsoft Excel</w:t>
+      </w:r>
+      <w:r>
+        <w:rPr>
+          <w:rFonts w:ascii="Calibri Light" w:eastAsia="Times New Roman" w:hAnsi="Calibri Light" w:cs="Calibri Light"/>
+          <w:kern w:val="0"/>
+          <w14:ligatures w14:val="none"/>
+        </w:rPr>
+        <w:t xml:space="preserve">, Figma, </w:t>
+      </w:r>
+      <w:proofErr w:type="spellStart"/>
+      <w:r>
+        <w:rPr>
+          <w:rFonts w:ascii="Calibri Light" w:eastAsia="Times New Roman" w:hAnsi="Calibri Light" w:cs="Calibri Light"/>
+          <w:kern w:val="0"/>
+          <w14:ligatures w14:val="none"/>
+        </w:rPr>
+        <w:t>Supabase</w:t>
+      </w:r>
+      <w:proofErr w:type="spellEnd"/>
+      <w:r>
+        <w:rPr>
+          <w:rFonts w:ascii="Calibri Light" w:eastAsia="Times New Roman" w:hAnsi="Calibri Light" w:cs="Calibri Light"/>
+          <w:kern w:val="0"/>
+          <w14:ligatures w14:val="none"/>
+        </w:rPr>
+        <w:t>, Make, Claude AI, ChatGPT</w:t>
+      </w:r>
+    </w:p>
+    <w:p>
+      <w:pPr>
+        <w:spacing w:before="100" w:beforeAutospacing="1" w:after="100" w:afterAutospacing="1" w:line="240" w:lineRule="auto"/>
+        <w:rPr>
+          <w:rFonts w:ascii="Calibri Light" w:eastAsia="Times New Roman" w:hAnsi="Calibri Light" w:cs="Calibri Light"/>
+          <w:b/>
+          <w:bCs/>
+          <w:kern w:val="0"/>
+          <w14:ligatures w14:val="none"/>
+        </w:rPr>
+      </w:pPr>
     </w:p>
     <w:p>
       <w:pPr>

</xml_diff>